<commit_message>
feat(sql): update file sql
</commit_message>
<xml_diff>
--- a/LY_THUYET/BUOI8/b8_1250080208_DoTienTri_12_DH_CNTT4.docx
+++ b/LY_THUYET/BUOI8/b8_1250080208_DoTienTri_12_DH_CNTT4.docx
@@ -99,8 +99,1226 @@
           <w:lang w:val="vi-VN"/>
         </w:rPr>
       </w:pPr>
+      <w:r>
+        <w:rPr>
+          <w:rFonts w:hint="default"/>
+          <w:lang w:val="vi-VN"/>
+        </w:rPr>
+        <w:t xml:space="preserve">Bài tập 1 </w:t>
+      </w:r>
+    </w:p>
+    <w:p>
+      <w:pPr>
+        <w:numPr>
+          <w:ilvl w:val="0"/>
+          <w:numId w:val="0"/>
+        </w:numPr>
+        <w:rPr>
+          <w:rFonts w:hint="default"/>
+          <w:lang w:val="vi-VN"/>
+        </w:rPr>
+      </w:pPr>
+      <w:r>
+        <w:rPr>
+          <w:rFonts w:hint="default"/>
+          <w:lang w:val="vi-VN"/>
+        </w:rPr>
+        <w:t>a/</w:t>
+      </w:r>
+    </w:p>
+    <w:p>
+      <w:pPr>
+        <w:numPr>
+          <w:ilvl w:val="0"/>
+          <w:numId w:val="0"/>
+        </w:numPr>
+        <w:rPr>
+          <w:rFonts w:hint="default"/>
+          <w:lang w:val="vi-VN"/>
+        </w:rPr>
+      </w:pPr>
+      <w:r>
+        <w:rPr>
+          <w:rFonts w:hint="default"/>
+          <w:lang w:val="vi-VN"/>
+        </w:rPr>
+        <w:t xml:space="preserve"> </w:t>
+      </w:r>
+      <w:r>
+        <w:drawing>
+          <wp:inline distT="0" distB="0" distL="114300" distR="114300">
+            <wp:extent cx="4460875" cy="2415540"/>
+            <wp:effectExtent l="0" t="0" r="15875" b="3810"/>
+            <wp:docPr id="1" name="Picture 1"/>
+            <wp:cNvGraphicFramePr>
+              <a:graphicFrameLocks xmlns:a="http://schemas.openxmlformats.org/drawingml/2006/main" noChangeAspect="1"/>
+            </wp:cNvGraphicFramePr>
+            <a:graphic xmlns:a="http://schemas.openxmlformats.org/drawingml/2006/main">
+              <a:graphicData uri="http://schemas.openxmlformats.org/drawingml/2006/picture">
+                <pic:pic xmlns:pic="http://schemas.openxmlformats.org/drawingml/2006/picture">
+                  <pic:nvPicPr>
+                    <pic:cNvPr id="1" name="Picture 1"/>
+                    <pic:cNvPicPr>
+                      <a:picLocks noChangeAspect="1"/>
+                    </pic:cNvPicPr>
+                  </pic:nvPicPr>
+                  <pic:blipFill>
+                    <a:blip r:embed="rId4"/>
+                    <a:stretch>
+                      <a:fillRect/>
+                    </a:stretch>
+                  </pic:blipFill>
+                  <pic:spPr>
+                    <a:xfrm>
+                      <a:off x="0" y="0"/>
+                      <a:ext cx="4460875" cy="2415540"/>
+                    </a:xfrm>
+                    <a:prstGeom prst="rect">
+                      <a:avLst/>
+                    </a:prstGeom>
+                    <a:noFill/>
+                    <a:ln>
+                      <a:noFill/>
+                    </a:ln>
+                  </pic:spPr>
+                </pic:pic>
+              </a:graphicData>
+            </a:graphic>
+          </wp:inline>
+        </w:drawing>
+      </w:r>
+    </w:p>
+    <w:p>
+      <w:pPr>
+        <w:numPr>
+          <w:ilvl w:val="0"/>
+          <w:numId w:val="0"/>
+        </w:numPr>
+        <w:rPr>
+          <w:rFonts w:hint="default"/>
+          <w:lang w:val="vi-VN"/>
+        </w:rPr>
+      </w:pPr>
+      <w:r>
+        <w:rPr>
+          <w:rFonts w:hint="default"/>
+          <w:lang w:val="vi-VN"/>
+        </w:rPr>
+        <w:t>b/</w:t>
+      </w:r>
+    </w:p>
+    <w:p>
+      <w:pPr>
+        <w:numPr>
+          <w:ilvl w:val="0"/>
+          <w:numId w:val="0"/>
+        </w:numPr>
+        <w:rPr>
+          <w:rFonts w:hint="default"/>
+          <w:lang w:val="vi-VN"/>
+        </w:rPr>
+      </w:pPr>
+      <w:r>
+        <w:drawing>
+          <wp:inline distT="0" distB="0" distL="114300" distR="114300">
+            <wp:extent cx="5270500" cy="4137025"/>
+            <wp:effectExtent l="0" t="0" r="6350" b="15875"/>
+            <wp:docPr id="2" name="Picture 2"/>
+            <wp:cNvGraphicFramePr>
+              <a:graphicFrameLocks xmlns:a="http://schemas.openxmlformats.org/drawingml/2006/main" noChangeAspect="1"/>
+            </wp:cNvGraphicFramePr>
+            <a:graphic xmlns:a="http://schemas.openxmlformats.org/drawingml/2006/main">
+              <a:graphicData uri="http://schemas.openxmlformats.org/drawingml/2006/picture">
+                <pic:pic xmlns:pic="http://schemas.openxmlformats.org/drawingml/2006/picture">
+                  <pic:nvPicPr>
+                    <pic:cNvPr id="2" name="Picture 2"/>
+                    <pic:cNvPicPr>
+                      <a:picLocks noChangeAspect="1"/>
+                    </pic:cNvPicPr>
+                  </pic:nvPicPr>
+                  <pic:blipFill>
+                    <a:blip r:embed="rId5"/>
+                    <a:stretch>
+                      <a:fillRect/>
+                    </a:stretch>
+                  </pic:blipFill>
+                  <pic:spPr>
+                    <a:xfrm>
+                      <a:off x="0" y="0"/>
+                      <a:ext cx="5270500" cy="4137025"/>
+                    </a:xfrm>
+                    <a:prstGeom prst="rect">
+                      <a:avLst/>
+                    </a:prstGeom>
+                    <a:noFill/>
+                    <a:ln>
+                      <a:noFill/>
+                    </a:ln>
+                  </pic:spPr>
+                </pic:pic>
+              </a:graphicData>
+            </a:graphic>
+          </wp:inline>
+        </w:drawing>
+      </w:r>
+    </w:p>
+    <w:p>
+      <w:pPr>
+        <w:numPr>
+          <w:ilvl w:val="0"/>
+          <w:numId w:val="0"/>
+        </w:numPr>
+        <w:rPr>
+          <w:rFonts w:hint="default"/>
+          <w:lang w:val="vi-VN"/>
+        </w:rPr>
+      </w:pPr>
+      <w:r>
+        <w:rPr>
+          <w:rFonts w:hint="default"/>
+          <w:lang w:val="vi-VN"/>
+        </w:rPr>
+        <w:t>C/</w:t>
+      </w:r>
+    </w:p>
+    <w:p>
+      <w:pPr>
+        <w:numPr>
+          <w:ilvl w:val="0"/>
+          <w:numId w:val="0"/>
+        </w:numPr>
+        <w:rPr>
+          <w:rFonts w:hint="default"/>
+          <w:lang w:val="vi-VN"/>
+        </w:rPr>
+      </w:pPr>
+      <w:r>
+        <w:drawing>
+          <wp:inline distT="0" distB="0" distL="114300" distR="114300">
+            <wp:extent cx="5269865" cy="3318510"/>
+            <wp:effectExtent l="0" t="0" r="6985" b="15240"/>
+            <wp:docPr id="3" name="Picture 3"/>
+            <wp:cNvGraphicFramePr>
+              <a:graphicFrameLocks xmlns:a="http://schemas.openxmlformats.org/drawingml/2006/main" noChangeAspect="1"/>
+            </wp:cNvGraphicFramePr>
+            <a:graphic xmlns:a="http://schemas.openxmlformats.org/drawingml/2006/main">
+              <a:graphicData uri="http://schemas.openxmlformats.org/drawingml/2006/picture">
+                <pic:pic xmlns:pic="http://schemas.openxmlformats.org/drawingml/2006/picture">
+                  <pic:nvPicPr>
+                    <pic:cNvPr id="3" name="Picture 3"/>
+                    <pic:cNvPicPr>
+                      <a:picLocks noChangeAspect="1"/>
+                    </pic:cNvPicPr>
+                  </pic:nvPicPr>
+                  <pic:blipFill>
+                    <a:blip r:embed="rId6"/>
+                    <a:stretch>
+                      <a:fillRect/>
+                    </a:stretch>
+                  </pic:blipFill>
+                  <pic:spPr>
+                    <a:xfrm>
+                      <a:off x="0" y="0"/>
+                      <a:ext cx="5269865" cy="3318510"/>
+                    </a:xfrm>
+                    <a:prstGeom prst="rect">
+                      <a:avLst/>
+                    </a:prstGeom>
+                    <a:noFill/>
+                    <a:ln>
+                      <a:noFill/>
+                    </a:ln>
+                  </pic:spPr>
+                </pic:pic>
+              </a:graphicData>
+            </a:graphic>
+          </wp:inline>
+        </w:drawing>
+      </w:r>
+    </w:p>
+    <w:p>
+      <w:pPr>
+        <w:numPr>
+          <w:ilvl w:val="0"/>
+          <w:numId w:val="0"/>
+        </w:numPr>
+        <w:rPr>
+          <w:rFonts w:hint="default"/>
+          <w:lang w:val="vi-VN"/>
+        </w:rPr>
+      </w:pPr>
+      <w:r>
+        <w:rPr>
+          <w:rFonts w:hint="default"/>
+          <w:lang w:val="vi-VN"/>
+        </w:rPr>
+        <w:t>D/</w:t>
+      </w:r>
+    </w:p>
+    <w:p>
+      <w:pPr>
+        <w:numPr>
+          <w:ilvl w:val="0"/>
+          <w:numId w:val="0"/>
+        </w:numPr>
+        <w:rPr>
+          <w:rFonts w:hint="default"/>
+          <w:lang w:val="vi-VN"/>
+        </w:rPr>
+      </w:pPr>
+      <w:r>
+        <w:drawing>
+          <wp:inline distT="0" distB="0" distL="114300" distR="114300">
+            <wp:extent cx="5269230" cy="3241040"/>
+            <wp:effectExtent l="0" t="0" r="7620" b="16510"/>
+            <wp:docPr id="4" name="Picture 4"/>
+            <wp:cNvGraphicFramePr>
+              <a:graphicFrameLocks xmlns:a="http://schemas.openxmlformats.org/drawingml/2006/main" noChangeAspect="1"/>
+            </wp:cNvGraphicFramePr>
+            <a:graphic xmlns:a="http://schemas.openxmlformats.org/drawingml/2006/main">
+              <a:graphicData uri="http://schemas.openxmlformats.org/drawingml/2006/picture">
+                <pic:pic xmlns:pic="http://schemas.openxmlformats.org/drawingml/2006/picture">
+                  <pic:nvPicPr>
+                    <pic:cNvPr id="4" name="Picture 4"/>
+                    <pic:cNvPicPr>
+                      <a:picLocks noChangeAspect="1"/>
+                    </pic:cNvPicPr>
+                  </pic:nvPicPr>
+                  <pic:blipFill>
+                    <a:blip r:embed="rId7"/>
+                    <a:stretch>
+                      <a:fillRect/>
+                    </a:stretch>
+                  </pic:blipFill>
+                  <pic:spPr>
+                    <a:xfrm>
+                      <a:off x="0" y="0"/>
+                      <a:ext cx="5269230" cy="3241040"/>
+                    </a:xfrm>
+                    <a:prstGeom prst="rect">
+                      <a:avLst/>
+                    </a:prstGeom>
+                    <a:noFill/>
+                    <a:ln>
+                      <a:noFill/>
+                    </a:ln>
+                  </pic:spPr>
+                </pic:pic>
+              </a:graphicData>
+            </a:graphic>
+          </wp:inline>
+        </w:drawing>
+      </w:r>
+    </w:p>
+    <w:p>
+      <w:pPr>
+        <w:numPr>
+          <w:ilvl w:val="0"/>
+          <w:numId w:val="0"/>
+        </w:numPr>
+        <w:rPr>
+          <w:rFonts w:hint="default"/>
+          <w:lang w:val="vi-VN"/>
+        </w:rPr>
+      </w:pPr>
+      <w:r>
+        <w:rPr>
+          <w:rFonts w:hint="default"/>
+          <w:lang w:val="vi-VN"/>
+        </w:rPr>
+        <w:t>E/</w:t>
+      </w:r>
+      <w:r>
+        <w:drawing>
+          <wp:inline distT="0" distB="0" distL="114300" distR="114300">
+            <wp:extent cx="5265420" cy="3236595"/>
+            <wp:effectExtent l="0" t="0" r="11430" b="1905"/>
+            <wp:docPr id="5" name="Picture 5"/>
+            <wp:cNvGraphicFramePr>
+              <a:graphicFrameLocks xmlns:a="http://schemas.openxmlformats.org/drawingml/2006/main" noChangeAspect="1"/>
+            </wp:cNvGraphicFramePr>
+            <a:graphic xmlns:a="http://schemas.openxmlformats.org/drawingml/2006/main">
+              <a:graphicData uri="http://schemas.openxmlformats.org/drawingml/2006/picture">
+                <pic:pic xmlns:pic="http://schemas.openxmlformats.org/drawingml/2006/picture">
+                  <pic:nvPicPr>
+                    <pic:cNvPr id="5" name="Picture 5"/>
+                    <pic:cNvPicPr>
+                      <a:picLocks noChangeAspect="1"/>
+                    </pic:cNvPicPr>
+                  </pic:nvPicPr>
+                  <pic:blipFill>
+                    <a:blip r:embed="rId8"/>
+                    <a:stretch>
+                      <a:fillRect/>
+                    </a:stretch>
+                  </pic:blipFill>
+                  <pic:spPr>
+                    <a:xfrm>
+                      <a:off x="0" y="0"/>
+                      <a:ext cx="5265420" cy="3236595"/>
+                    </a:xfrm>
+                    <a:prstGeom prst="rect">
+                      <a:avLst/>
+                    </a:prstGeom>
+                    <a:noFill/>
+                    <a:ln>
+                      <a:noFill/>
+                    </a:ln>
+                  </pic:spPr>
+                </pic:pic>
+              </a:graphicData>
+            </a:graphic>
+          </wp:inline>
+        </w:drawing>
+      </w:r>
+    </w:p>
+    <w:p>
+      <w:pPr>
+        <w:numPr>
+          <w:ilvl w:val="0"/>
+          <w:numId w:val="0"/>
+        </w:numPr>
+        <w:rPr>
+          <w:rFonts w:hint="default"/>
+          <w:lang w:val="vi-VN"/>
+        </w:rPr>
+      </w:pPr>
+      <w:r>
+        <w:rPr>
+          <w:rFonts w:hint="default"/>
+          <w:lang w:val="vi-VN"/>
+        </w:rPr>
+        <w:t>F/</w:t>
+      </w:r>
+    </w:p>
+    <w:p>
+      <w:pPr>
+        <w:numPr>
+          <w:ilvl w:val="0"/>
+          <w:numId w:val="0"/>
+        </w:numPr>
+        <w:rPr>
+          <w:rFonts w:hint="default"/>
+          <w:lang w:val="vi-VN"/>
+        </w:rPr>
+      </w:pPr>
+      <w:r>
+        <w:drawing>
+          <wp:inline distT="0" distB="0" distL="114300" distR="114300">
+            <wp:extent cx="5270500" cy="2936875"/>
+            <wp:effectExtent l="0" t="0" r="6350" b="15875"/>
+            <wp:docPr id="6" name="Picture 6"/>
+            <wp:cNvGraphicFramePr>
+              <a:graphicFrameLocks xmlns:a="http://schemas.openxmlformats.org/drawingml/2006/main" noChangeAspect="1"/>
+            </wp:cNvGraphicFramePr>
+            <a:graphic xmlns:a="http://schemas.openxmlformats.org/drawingml/2006/main">
+              <a:graphicData uri="http://schemas.openxmlformats.org/drawingml/2006/picture">
+                <pic:pic xmlns:pic="http://schemas.openxmlformats.org/drawingml/2006/picture">
+                  <pic:nvPicPr>
+                    <pic:cNvPr id="6" name="Picture 6"/>
+                    <pic:cNvPicPr>
+                      <a:picLocks noChangeAspect="1"/>
+                    </pic:cNvPicPr>
+                  </pic:nvPicPr>
+                  <pic:blipFill>
+                    <a:blip r:embed="rId9"/>
+                    <a:stretch>
+                      <a:fillRect/>
+                    </a:stretch>
+                  </pic:blipFill>
+                  <pic:spPr>
+                    <a:xfrm>
+                      <a:off x="0" y="0"/>
+                      <a:ext cx="5270500" cy="2936875"/>
+                    </a:xfrm>
+                    <a:prstGeom prst="rect">
+                      <a:avLst/>
+                    </a:prstGeom>
+                    <a:noFill/>
+                    <a:ln>
+                      <a:noFill/>
+                    </a:ln>
+                  </pic:spPr>
+                </pic:pic>
+              </a:graphicData>
+            </a:graphic>
+          </wp:inline>
+        </w:drawing>
+      </w:r>
+    </w:p>
+    <w:p>
+      <w:pPr>
+        <w:numPr>
+          <w:ilvl w:val="0"/>
+          <w:numId w:val="0"/>
+        </w:numPr>
+        <w:rPr>
+          <w:rFonts w:hint="default"/>
+          <w:lang w:val="vi-VN"/>
+        </w:rPr>
+      </w:pPr>
+      <w:r>
+        <w:rPr>
+          <w:rFonts w:hint="default"/>
+          <w:lang w:val="vi-VN"/>
+        </w:rPr>
+        <w:t>G/</w:t>
+      </w:r>
+    </w:p>
+    <w:p>
+      <w:pPr>
+        <w:numPr>
+          <w:ilvl w:val="0"/>
+          <w:numId w:val="0"/>
+        </w:numPr>
+      </w:pPr>
+      <w:r>
+        <w:drawing>
+          <wp:inline distT="0" distB="0" distL="114300" distR="114300">
+            <wp:extent cx="5262880" cy="3072130"/>
+            <wp:effectExtent l="0" t="0" r="13970" b="13970"/>
+            <wp:docPr id="7" name="Picture 7"/>
+            <wp:cNvGraphicFramePr>
+              <a:graphicFrameLocks xmlns:a="http://schemas.openxmlformats.org/drawingml/2006/main" noChangeAspect="1"/>
+            </wp:cNvGraphicFramePr>
+            <a:graphic xmlns:a="http://schemas.openxmlformats.org/drawingml/2006/main">
+              <a:graphicData uri="http://schemas.openxmlformats.org/drawingml/2006/picture">
+                <pic:pic xmlns:pic="http://schemas.openxmlformats.org/drawingml/2006/picture">
+                  <pic:nvPicPr>
+                    <pic:cNvPr id="7" name="Picture 7"/>
+                    <pic:cNvPicPr>
+                      <a:picLocks noChangeAspect="1"/>
+                    </pic:cNvPicPr>
+                  </pic:nvPicPr>
+                  <pic:blipFill>
+                    <a:blip r:embed="rId10"/>
+                    <a:stretch>
+                      <a:fillRect/>
+                    </a:stretch>
+                  </pic:blipFill>
+                  <pic:spPr>
+                    <a:xfrm>
+                      <a:off x="0" y="0"/>
+                      <a:ext cx="5262880" cy="3072130"/>
+                    </a:xfrm>
+                    <a:prstGeom prst="rect">
+                      <a:avLst/>
+                    </a:prstGeom>
+                    <a:noFill/>
+                    <a:ln>
+                      <a:noFill/>
+                    </a:ln>
+                  </pic:spPr>
+                </pic:pic>
+              </a:graphicData>
+            </a:graphic>
+          </wp:inline>
+        </w:drawing>
+      </w:r>
+    </w:p>
+    <w:p>
+      <w:pPr>
+        <w:numPr>
+          <w:ilvl w:val="0"/>
+          <w:numId w:val="0"/>
+        </w:numPr>
+        <w:rPr>
+          <w:rFonts w:hint="default"/>
+          <w:lang w:val="vi-VN"/>
+        </w:rPr>
+      </w:pPr>
+      <w:r>
+        <w:rPr>
+          <w:rFonts w:hint="default"/>
+          <w:lang w:val="vi-VN"/>
+        </w:rPr>
+        <w:t>H/</w:t>
+      </w:r>
+    </w:p>
+    <w:p>
+      <w:pPr>
+        <w:numPr>
+          <w:ilvl w:val="0"/>
+          <w:numId w:val="0"/>
+        </w:numPr>
+        <w:rPr>
+          <w:rFonts w:hint="default"/>
+          <w:lang w:val="vi-VN"/>
+        </w:rPr>
+      </w:pPr>
+      <w:r>
+        <w:drawing>
+          <wp:inline distT="0" distB="0" distL="114300" distR="114300">
+            <wp:extent cx="5265420" cy="2625090"/>
+            <wp:effectExtent l="0" t="0" r="11430" b="3810"/>
+            <wp:docPr id="8" name="Picture 8"/>
+            <wp:cNvGraphicFramePr>
+              <a:graphicFrameLocks xmlns:a="http://schemas.openxmlformats.org/drawingml/2006/main" noChangeAspect="1"/>
+            </wp:cNvGraphicFramePr>
+            <a:graphic xmlns:a="http://schemas.openxmlformats.org/drawingml/2006/main">
+              <a:graphicData uri="http://schemas.openxmlformats.org/drawingml/2006/picture">
+                <pic:pic xmlns:pic="http://schemas.openxmlformats.org/drawingml/2006/picture">
+                  <pic:nvPicPr>
+                    <pic:cNvPr id="8" name="Picture 8"/>
+                    <pic:cNvPicPr>
+                      <a:picLocks noChangeAspect="1"/>
+                    </pic:cNvPicPr>
+                  </pic:nvPicPr>
+                  <pic:blipFill>
+                    <a:blip r:embed="rId11"/>
+                    <a:stretch>
+                      <a:fillRect/>
+                    </a:stretch>
+                  </pic:blipFill>
+                  <pic:spPr>
+                    <a:xfrm>
+                      <a:off x="0" y="0"/>
+                      <a:ext cx="5265420" cy="2625090"/>
+                    </a:xfrm>
+                    <a:prstGeom prst="rect">
+                      <a:avLst/>
+                    </a:prstGeom>
+                    <a:noFill/>
+                    <a:ln>
+                      <a:noFill/>
+                    </a:ln>
+                  </pic:spPr>
+                </pic:pic>
+              </a:graphicData>
+            </a:graphic>
+          </wp:inline>
+        </w:drawing>
+      </w:r>
+    </w:p>
+    <w:p>
+      <w:pPr>
+        <w:numPr>
+          <w:ilvl w:val="0"/>
+          <w:numId w:val="0"/>
+        </w:numPr>
+        <w:rPr>
+          <w:rFonts w:hint="default"/>
+          <w:lang w:val="vi-VN"/>
+        </w:rPr>
+      </w:pPr>
+    </w:p>
+    <w:p>
+      <w:pPr>
+        <w:numPr>
+          <w:ilvl w:val="0"/>
+          <w:numId w:val="0"/>
+        </w:numPr>
+        <w:rPr>
+          <w:rFonts w:hint="default"/>
+          <w:lang w:val="vi-VN"/>
+        </w:rPr>
+      </w:pPr>
+      <w:r>
+        <w:rPr>
+          <w:rFonts w:hint="default"/>
+          <w:lang w:val="vi-VN"/>
+        </w:rPr>
+        <w:t xml:space="preserve">Bài 2 </w:t>
+      </w:r>
+    </w:p>
+    <w:p>
+      <w:pPr>
+        <w:numPr>
+          <w:ilvl w:val="0"/>
+          <w:numId w:val="0"/>
+        </w:numPr>
+        <w:rPr>
+          <w:rFonts w:hint="default"/>
+          <w:lang w:val="vi-VN"/>
+        </w:rPr>
+      </w:pPr>
+      <w:r>
+        <w:rPr>
+          <w:rFonts w:hint="default"/>
+          <w:lang w:val="vi-VN"/>
+        </w:rPr>
+        <w:t>A/</w:t>
+      </w:r>
+    </w:p>
+    <w:p>
+      <w:pPr>
+        <w:numPr>
+          <w:ilvl w:val="0"/>
+          <w:numId w:val="0"/>
+        </w:numPr>
+        <w:rPr>
+          <w:rFonts w:hint="default"/>
+          <w:lang w:val="vi-VN"/>
+        </w:rPr>
+      </w:pPr>
+      <w:r>
+        <w:drawing>
+          <wp:inline distT="0" distB="0" distL="114300" distR="114300">
+            <wp:extent cx="5273040" cy="3529330"/>
+            <wp:effectExtent l="0" t="0" r="3810" b="13970"/>
+            <wp:docPr id="9" name="Picture 9"/>
+            <wp:cNvGraphicFramePr>
+              <a:graphicFrameLocks xmlns:a="http://schemas.openxmlformats.org/drawingml/2006/main" noChangeAspect="1"/>
+            </wp:cNvGraphicFramePr>
+            <a:graphic xmlns:a="http://schemas.openxmlformats.org/drawingml/2006/main">
+              <a:graphicData uri="http://schemas.openxmlformats.org/drawingml/2006/picture">
+                <pic:pic xmlns:pic="http://schemas.openxmlformats.org/drawingml/2006/picture">
+                  <pic:nvPicPr>
+                    <pic:cNvPr id="9" name="Picture 9"/>
+                    <pic:cNvPicPr>
+                      <a:picLocks noChangeAspect="1"/>
+                    </pic:cNvPicPr>
+                  </pic:nvPicPr>
+                  <pic:blipFill>
+                    <a:blip r:embed="rId12"/>
+                    <a:stretch>
+                      <a:fillRect/>
+                    </a:stretch>
+                  </pic:blipFill>
+                  <pic:spPr>
+                    <a:xfrm>
+                      <a:off x="0" y="0"/>
+                      <a:ext cx="5273040" cy="3529330"/>
+                    </a:xfrm>
+                    <a:prstGeom prst="rect">
+                      <a:avLst/>
+                    </a:prstGeom>
+                    <a:noFill/>
+                    <a:ln>
+                      <a:noFill/>
+                    </a:ln>
+                  </pic:spPr>
+                </pic:pic>
+              </a:graphicData>
+            </a:graphic>
+          </wp:inline>
+        </w:drawing>
+      </w:r>
+    </w:p>
+    <w:p>
+      <w:pPr>
+        <w:numPr>
+          <w:ilvl w:val="0"/>
+          <w:numId w:val="0"/>
+        </w:numPr>
+        <w:rPr>
+          <w:rFonts w:hint="default"/>
+          <w:lang w:val="vi-VN"/>
+        </w:rPr>
+      </w:pPr>
+      <w:r>
+        <w:rPr>
+          <w:rFonts w:hint="default"/>
+          <w:lang w:val="vi-VN"/>
+        </w:rPr>
+        <w:t>B/</w:t>
+      </w:r>
+    </w:p>
+    <w:p>
+      <w:pPr>
+        <w:numPr>
+          <w:ilvl w:val="0"/>
+          <w:numId w:val="0"/>
+        </w:numPr>
+        <w:rPr>
+          <w:rFonts w:hint="default"/>
+          <w:lang w:val="vi-VN"/>
+        </w:rPr>
+      </w:pPr>
+      <w:r>
+        <w:drawing>
+          <wp:inline distT="0" distB="0" distL="114300" distR="114300">
+            <wp:extent cx="635" cy="0"/>
+            <wp:effectExtent l="0" t="0" r="0" b="0"/>
+            <wp:docPr id="10" name="Picture 10"/>
+            <wp:cNvGraphicFramePr>
+              <a:graphicFrameLocks xmlns:a="http://schemas.openxmlformats.org/drawingml/2006/main" noChangeAspect="1"/>
+            </wp:cNvGraphicFramePr>
+            <a:graphic xmlns:a="http://schemas.openxmlformats.org/drawingml/2006/main">
+              <a:graphicData uri="http://schemas.openxmlformats.org/drawingml/2006/picture">
+                <pic:pic xmlns:pic="http://schemas.openxmlformats.org/drawingml/2006/picture">
+                  <pic:nvPicPr>
+                    <pic:cNvPr id="10" name="Picture 10"/>
+                    <pic:cNvPicPr>
+                      <a:picLocks noChangeAspect="1"/>
+                    </pic:cNvPicPr>
+                  </pic:nvPicPr>
+                  <pic:blipFill>
+                    <a:blip r:embed="rId13"/>
+                    <a:stretch>
+                      <a:fillRect/>
+                    </a:stretch>
+                  </pic:blipFill>
+                  <pic:spPr>
+                    <a:xfrm>
+                      <a:off x="0" y="0"/>
+                      <a:ext cx="635" cy="0"/>
+                    </a:xfrm>
+                    <a:prstGeom prst="rect">
+                      <a:avLst/>
+                    </a:prstGeom>
+                    <a:noFill/>
+                    <a:ln>
+                      <a:noFill/>
+                    </a:ln>
+                  </pic:spPr>
+                </pic:pic>
+              </a:graphicData>
+            </a:graphic>
+          </wp:inline>
+        </w:drawing>
+      </w:r>
+      <w:r>
+        <w:drawing>
+          <wp:inline distT="0" distB="0" distL="114300" distR="114300">
+            <wp:extent cx="5266055" cy="3317875"/>
+            <wp:effectExtent l="0" t="0" r="10795" b="15875"/>
+            <wp:docPr id="11" name="Picture 11"/>
+            <wp:cNvGraphicFramePr>
+              <a:graphicFrameLocks xmlns:a="http://schemas.openxmlformats.org/drawingml/2006/main" noChangeAspect="1"/>
+            </wp:cNvGraphicFramePr>
+            <a:graphic xmlns:a="http://schemas.openxmlformats.org/drawingml/2006/main">
+              <a:graphicData uri="http://schemas.openxmlformats.org/drawingml/2006/picture">
+                <pic:pic xmlns:pic="http://schemas.openxmlformats.org/drawingml/2006/picture">
+                  <pic:nvPicPr>
+                    <pic:cNvPr id="11" name="Picture 11"/>
+                    <pic:cNvPicPr>
+                      <a:picLocks noChangeAspect="1"/>
+                    </pic:cNvPicPr>
+                  </pic:nvPicPr>
+                  <pic:blipFill>
+                    <a:blip r:embed="rId14"/>
+                    <a:stretch>
+                      <a:fillRect/>
+                    </a:stretch>
+                  </pic:blipFill>
+                  <pic:spPr>
+                    <a:xfrm>
+                      <a:off x="0" y="0"/>
+                      <a:ext cx="5266055" cy="3317875"/>
+                    </a:xfrm>
+                    <a:prstGeom prst="rect">
+                      <a:avLst/>
+                    </a:prstGeom>
+                    <a:noFill/>
+                    <a:ln>
+                      <a:noFill/>
+                    </a:ln>
+                  </pic:spPr>
+                </pic:pic>
+              </a:graphicData>
+            </a:graphic>
+          </wp:inline>
+        </w:drawing>
+      </w:r>
+    </w:p>
+    <w:p>
+      <w:pPr>
+        <w:numPr>
+          <w:ilvl w:val="0"/>
+          <w:numId w:val="0"/>
+        </w:numPr>
+        <w:rPr>
+          <w:rFonts w:hint="default"/>
+          <w:lang w:val="vi-VN"/>
+        </w:rPr>
+      </w:pPr>
+      <w:r>
+        <w:rPr>
+          <w:rFonts w:hint="default"/>
+          <w:lang w:val="vi-VN"/>
+        </w:rPr>
+        <w:t>C/</w:t>
+      </w:r>
+    </w:p>
+    <w:p>
+      <w:pPr>
+        <w:numPr>
+          <w:ilvl w:val="0"/>
+          <w:numId w:val="0"/>
+        </w:numPr>
+        <w:rPr>
+          <w:rFonts w:hint="default"/>
+          <w:lang w:val="vi-VN"/>
+        </w:rPr>
+      </w:pPr>
+      <w:r>
+        <w:drawing>
+          <wp:inline distT="0" distB="0" distL="114300" distR="114300">
+            <wp:extent cx="5270500" cy="3662680"/>
+            <wp:effectExtent l="0" t="0" r="6350" b="13970"/>
+            <wp:docPr id="12" name="Picture 12"/>
+            <wp:cNvGraphicFramePr>
+              <a:graphicFrameLocks xmlns:a="http://schemas.openxmlformats.org/drawingml/2006/main" noChangeAspect="1"/>
+            </wp:cNvGraphicFramePr>
+            <a:graphic xmlns:a="http://schemas.openxmlformats.org/drawingml/2006/main">
+              <a:graphicData uri="http://schemas.openxmlformats.org/drawingml/2006/picture">
+                <pic:pic xmlns:pic="http://schemas.openxmlformats.org/drawingml/2006/picture">
+                  <pic:nvPicPr>
+                    <pic:cNvPr id="12" name="Picture 12"/>
+                    <pic:cNvPicPr>
+                      <a:picLocks noChangeAspect="1"/>
+                    </pic:cNvPicPr>
+                  </pic:nvPicPr>
+                  <pic:blipFill>
+                    <a:blip r:embed="rId15"/>
+                    <a:stretch>
+                      <a:fillRect/>
+                    </a:stretch>
+                  </pic:blipFill>
+                  <pic:spPr>
+                    <a:xfrm>
+                      <a:off x="0" y="0"/>
+                      <a:ext cx="5270500" cy="3662680"/>
+                    </a:xfrm>
+                    <a:prstGeom prst="rect">
+                      <a:avLst/>
+                    </a:prstGeom>
+                    <a:noFill/>
+                    <a:ln>
+                      <a:noFill/>
+                    </a:ln>
+                  </pic:spPr>
+                </pic:pic>
+              </a:graphicData>
+            </a:graphic>
+          </wp:inline>
+        </w:drawing>
+      </w:r>
+    </w:p>
+    <w:p>
+      <w:pPr>
+        <w:numPr>
+          <w:ilvl w:val="0"/>
+          <w:numId w:val="0"/>
+        </w:numPr>
+        <w:rPr>
+          <w:rFonts w:hint="default"/>
+          <w:lang w:val="vi-VN"/>
+        </w:rPr>
+      </w:pPr>
+      <w:r>
+        <w:rPr>
+          <w:rFonts w:hint="default"/>
+          <w:lang w:val="vi-VN"/>
+        </w:rPr>
+        <w:t>D/</w:t>
+      </w:r>
+    </w:p>
+    <w:p>
+      <w:pPr>
+        <w:numPr>
+          <w:ilvl w:val="0"/>
+          <w:numId w:val="0"/>
+        </w:numPr>
+        <w:rPr>
+          <w:rFonts w:hint="default"/>
+          <w:lang w:val="vi-VN"/>
+        </w:rPr>
+      </w:pPr>
+      <w:r>
+        <w:drawing>
+          <wp:inline distT="0" distB="0" distL="114300" distR="114300">
+            <wp:extent cx="5271135" cy="3137535"/>
+            <wp:effectExtent l="0" t="0" r="5715" b="5715"/>
+            <wp:docPr id="13" name="Picture 13"/>
+            <wp:cNvGraphicFramePr>
+              <a:graphicFrameLocks xmlns:a="http://schemas.openxmlformats.org/drawingml/2006/main" noChangeAspect="1"/>
+            </wp:cNvGraphicFramePr>
+            <a:graphic xmlns:a="http://schemas.openxmlformats.org/drawingml/2006/main">
+              <a:graphicData uri="http://schemas.openxmlformats.org/drawingml/2006/picture">
+                <pic:pic xmlns:pic="http://schemas.openxmlformats.org/drawingml/2006/picture">
+                  <pic:nvPicPr>
+                    <pic:cNvPr id="13" name="Picture 13"/>
+                    <pic:cNvPicPr>
+                      <a:picLocks noChangeAspect="1"/>
+                    </pic:cNvPicPr>
+                  </pic:nvPicPr>
+                  <pic:blipFill>
+                    <a:blip r:embed="rId16"/>
+                    <a:stretch>
+                      <a:fillRect/>
+                    </a:stretch>
+                  </pic:blipFill>
+                  <pic:spPr>
+                    <a:xfrm>
+                      <a:off x="0" y="0"/>
+                      <a:ext cx="5271135" cy="3137535"/>
+                    </a:xfrm>
+                    <a:prstGeom prst="rect">
+                      <a:avLst/>
+                    </a:prstGeom>
+                    <a:noFill/>
+                    <a:ln>
+                      <a:noFill/>
+                    </a:ln>
+                  </pic:spPr>
+                </pic:pic>
+              </a:graphicData>
+            </a:graphic>
+          </wp:inline>
+        </w:drawing>
+      </w:r>
+    </w:p>
+    <w:p>
+      <w:pPr>
+        <w:numPr>
+          <w:ilvl w:val="0"/>
+          <w:numId w:val="0"/>
+        </w:numPr>
+        <w:rPr>
+          <w:rFonts w:hint="default"/>
+          <w:lang w:val="vi-VN"/>
+        </w:rPr>
+      </w:pPr>
+      <w:r>
+        <w:rPr>
+          <w:rFonts w:hint="default"/>
+          <w:lang w:val="vi-VN"/>
+        </w:rPr>
+        <w:t>E/</w:t>
+      </w:r>
+    </w:p>
+    <w:p>
+      <w:pPr>
+        <w:numPr>
+          <w:ilvl w:val="0"/>
+          <w:numId w:val="0"/>
+        </w:numPr>
+        <w:rPr>
+          <w:rFonts w:hint="default"/>
+          <w:lang w:val="vi-VN"/>
+        </w:rPr>
+      </w:pPr>
+      <w:r>
+        <w:drawing>
+          <wp:inline distT="0" distB="0" distL="114300" distR="114300">
+            <wp:extent cx="5269230" cy="3789680"/>
+            <wp:effectExtent l="0" t="0" r="7620" b="1270"/>
+            <wp:docPr id="14" name="Picture 14"/>
+            <wp:cNvGraphicFramePr>
+              <a:graphicFrameLocks xmlns:a="http://schemas.openxmlformats.org/drawingml/2006/main" noChangeAspect="1"/>
+            </wp:cNvGraphicFramePr>
+            <a:graphic xmlns:a="http://schemas.openxmlformats.org/drawingml/2006/main">
+              <a:graphicData uri="http://schemas.openxmlformats.org/drawingml/2006/picture">
+                <pic:pic xmlns:pic="http://schemas.openxmlformats.org/drawingml/2006/picture">
+                  <pic:nvPicPr>
+                    <pic:cNvPr id="14" name="Picture 14"/>
+                    <pic:cNvPicPr>
+                      <a:picLocks noChangeAspect="1"/>
+                    </pic:cNvPicPr>
+                  </pic:nvPicPr>
+                  <pic:blipFill>
+                    <a:blip r:embed="rId17"/>
+                    <a:stretch>
+                      <a:fillRect/>
+                    </a:stretch>
+                  </pic:blipFill>
+                  <pic:spPr>
+                    <a:xfrm>
+                      <a:off x="0" y="0"/>
+                      <a:ext cx="5269230" cy="3789680"/>
+                    </a:xfrm>
+                    <a:prstGeom prst="rect">
+                      <a:avLst/>
+                    </a:prstGeom>
+                    <a:noFill/>
+                    <a:ln>
+                      <a:noFill/>
+                    </a:ln>
+                  </pic:spPr>
+                </pic:pic>
+              </a:graphicData>
+            </a:graphic>
+          </wp:inline>
+        </w:drawing>
+      </w:r>
+    </w:p>
+    <w:p>
+      <w:pPr>
+        <w:numPr>
+          <w:ilvl w:val="0"/>
+          <w:numId w:val="0"/>
+        </w:numPr>
+        <w:rPr>
+          <w:rFonts w:hint="default"/>
+          <w:lang w:val="vi-VN"/>
+        </w:rPr>
+      </w:pPr>
+      <w:r>
+        <w:rPr>
+          <w:rFonts w:hint="default"/>
+          <w:lang w:val="vi-VN"/>
+        </w:rPr>
+        <w:t>F/</w:t>
+      </w:r>
+    </w:p>
+    <w:p>
+      <w:pPr>
+        <w:numPr>
+          <w:ilvl w:val="0"/>
+          <w:numId w:val="0"/>
+        </w:numPr>
+        <w:rPr>
+          <w:rFonts w:hint="default"/>
+          <w:lang w:val="vi-VN"/>
+        </w:rPr>
+      </w:pPr>
+      <w:r>
+        <w:drawing>
+          <wp:inline distT="0" distB="0" distL="114300" distR="114300">
+            <wp:extent cx="5274310" cy="3272790"/>
+            <wp:effectExtent l="0" t="0" r="2540" b="3810"/>
+            <wp:docPr id="15" name="Picture 15"/>
+            <wp:cNvGraphicFramePr>
+              <a:graphicFrameLocks xmlns:a="http://schemas.openxmlformats.org/drawingml/2006/main" noChangeAspect="1"/>
+            </wp:cNvGraphicFramePr>
+            <a:graphic xmlns:a="http://schemas.openxmlformats.org/drawingml/2006/main">
+              <a:graphicData uri="http://schemas.openxmlformats.org/drawingml/2006/picture">
+                <pic:pic xmlns:pic="http://schemas.openxmlformats.org/drawingml/2006/picture">
+                  <pic:nvPicPr>
+                    <pic:cNvPr id="15" name="Picture 15"/>
+                    <pic:cNvPicPr>
+                      <a:picLocks noChangeAspect="1"/>
+                    </pic:cNvPicPr>
+                  </pic:nvPicPr>
+                  <pic:blipFill>
+                    <a:blip r:embed="rId18"/>
+                    <a:stretch>
+                      <a:fillRect/>
+                    </a:stretch>
+                  </pic:blipFill>
+                  <pic:spPr>
+                    <a:xfrm>
+                      <a:off x="0" y="0"/>
+                      <a:ext cx="5274310" cy="3272790"/>
+                    </a:xfrm>
+                    <a:prstGeom prst="rect">
+                      <a:avLst/>
+                    </a:prstGeom>
+                    <a:noFill/>
+                    <a:ln>
+                      <a:noFill/>
+                    </a:ln>
+                  </pic:spPr>
+                </pic:pic>
+              </a:graphicData>
+            </a:graphic>
+          </wp:inline>
+        </w:drawing>
+      </w:r>
+    </w:p>
+    <w:p>
+      <w:pPr>
+        <w:numPr>
+          <w:ilvl w:val="0"/>
+          <w:numId w:val="0"/>
+        </w:numPr>
+        <w:rPr>
+          <w:rFonts w:hint="default"/>
+          <w:lang w:val="vi-VN"/>
+        </w:rPr>
+      </w:pPr>
+      <w:r>
+        <w:rPr>
+          <w:rFonts w:hint="default"/>
+          <w:lang w:val="vi-VN"/>
+        </w:rPr>
+        <w:t>G/</w:t>
+      </w:r>
+    </w:p>
+    <w:p>
+      <w:pPr>
+        <w:numPr>
+          <w:ilvl w:val="0"/>
+          <w:numId w:val="0"/>
+        </w:numPr>
+        <w:rPr>
+          <w:rFonts w:hint="default"/>
+          <w:lang w:val="vi-VN"/>
+        </w:rPr>
+      </w:pPr>
+    </w:p>
+    <w:p>
+      <w:pPr>
+        <w:numPr>
+          <w:ilvl w:val="0"/>
+          <w:numId w:val="0"/>
+        </w:numPr>
+        <w:rPr>
+          <w:rFonts w:hint="default"/>
+          <w:lang w:val="vi-VN"/>
+        </w:rPr>
+      </w:pPr>
+    </w:p>
+    <w:p>
+      <w:pPr>
+        <w:numPr>
+          <w:ilvl w:val="0"/>
+          <w:numId w:val="0"/>
+        </w:numPr>
+        <w:rPr>
+          <w:rFonts w:hint="default"/>
+          <w:lang w:val="vi-VN"/>
+        </w:rPr>
+      </w:pPr>
+      <w:r>
+        <w:drawing>
+          <wp:inline distT="0" distB="0" distL="114300" distR="114300">
+            <wp:extent cx="5273675" cy="3044190"/>
+            <wp:effectExtent l="0" t="0" r="3175" b="3810"/>
+            <wp:docPr id="16" name="Picture 16"/>
+            <wp:cNvGraphicFramePr>
+              <a:graphicFrameLocks xmlns:a="http://schemas.openxmlformats.org/drawingml/2006/main" noChangeAspect="1"/>
+            </wp:cNvGraphicFramePr>
+            <a:graphic xmlns:a="http://schemas.openxmlformats.org/drawingml/2006/main">
+              <a:graphicData uri="http://schemas.openxmlformats.org/drawingml/2006/picture">
+                <pic:pic xmlns:pic="http://schemas.openxmlformats.org/drawingml/2006/picture">
+                  <pic:nvPicPr>
+                    <pic:cNvPr id="16" name="Picture 16"/>
+                    <pic:cNvPicPr>
+                      <a:picLocks noChangeAspect="1"/>
+                    </pic:cNvPicPr>
+                  </pic:nvPicPr>
+                  <pic:blipFill>
+                    <a:blip r:embed="rId19"/>
+                    <a:stretch>
+                      <a:fillRect/>
+                    </a:stretch>
+                  </pic:blipFill>
+                  <pic:spPr>
+                    <a:xfrm>
+                      <a:off x="0" y="0"/>
+                      <a:ext cx="5273675" cy="3044190"/>
+                    </a:xfrm>
+                    <a:prstGeom prst="rect">
+                      <a:avLst/>
+                    </a:prstGeom>
+                    <a:noFill/>
+                    <a:ln>
+                      <a:noFill/>
+                    </a:ln>
+                  </pic:spPr>
+                </pic:pic>
+              </a:graphicData>
+            </a:graphic>
+          </wp:inline>
+        </w:drawing>
+      </w:r>
       <w:bookmarkStart w:id="0" w:name="_GoBack"/>
       <w:bookmarkEnd w:id="0"/>
+    </w:p>
+    <w:p>
+      <w:pPr>
+        <w:numPr>
+          <w:ilvl w:val="0"/>
+          <w:numId w:val="0"/>
+        </w:numPr>
+        <w:rPr>
+          <w:rFonts w:hint="default"/>
+          <w:lang w:val="vi-VN"/>
+        </w:rPr>
+      </w:pPr>
     </w:p>
     <w:sectPr>
       <w:pgSz w:w="11906" w:h="16838"/>

</xml_diff>